<commit_message>
Switch submission Figure 1 to v3 (one-page 3x2 layout)
- code/11_Figure1_v3_onepage.R: single-file assembler that builds all
  six panels with unified typography (BASE 8pt body, 9pt panel titles,
  panel tags 13pt) and arranges them in a 3-row x 2-col layout sized
  to A4 portrait (17.4 x 24.0 cm).
- Panel titles centered above each plot, panel tags at the top-left
  corner without overlapping the title, cleaner legends throughout.
- Move panel C legend inside the plot area (lower-right white space)
  and shift panel D stats annotation from upper-left to lower-right
  to avoid the dense scatter.
- Submission template now embeds Figure1_v3.png and the build script
  picks up the new path.
- Regenerate MattersArising_v0.3.{pdf,docx} and CoverLetter.{pdf,docx}.

Co-Authored-By: Claude Opus 4.8 <noreply@anthropic.com>
</commit_message>
<xml_diff>
--- a/manuscript/MattersArising_v0.3.docx
+++ b/manuscript/MattersArising_v0.3.docx
@@ -847,14 +847,14 @@
       <w:r>
         <w:drawing>
           <wp:inline>
-            <wp:extent cx="5334000" cy="4904424"/>
+            <wp:extent cx="5334000" cy="7357286"/>
             <wp:effectExtent b="0" l="0" r="0" t="0"/>
             <wp:docPr descr="Two methodological concerns regarding Dohlman et al. (Cell, 2026). (A) Distribution of PCE scores by ground-truth category in a synthetic 100kGP-like cohort (27 cancer types, n = 15,371; 50 species per category). Dashed line: PCE = 0.7 contaminant cutoff used by Dohlman et al.1 (B) Per-cancer prevalence patterns of representative species (4 per category), color-coded by ground-truth category; cross-cancer real microbiota and true contaminants are visually and quantitatively indistinguishable. (C) PCE threshold sensitivity: across thresholds 0.3–0.99, the fraction of cross-cancer real microbiota lost to the filter (purple, dashed) tracks the fraction of true contaminants correctly removed (green) almost identically; the FDR among species classified as contaminants (red) stays above 50% until thresholds at which contaminants are also no longer caught. (D) Raw correlation between log10(TMB) and log10(microbial load) in TCGA orodigestive cancers (TCMA-decontaminated WXS2; n = 1,024); r = 0.115, p = 2.2 × 10−4. (E) Site-stratified Pearson r before (red, raw) and after (blue, purity-adjusted) regressing both variables on tumor purity; direction reverses in ESCA and HNSC. (F) Within-purity-quintile r in pooled orodigestive cancers; the TMB–microbe correlation is detectable only in the upper purity quintiles, indicating partial confounding by the shared host-DNA denominator." title="" id="1" name="Picture"/>
             <a:graphic>
               <a:graphicData uri="http://schemas.openxmlformats.org/drawingml/2006/picture">
                 <pic:pic>
                   <pic:nvPicPr>
-                    <pic:cNvPr descr="../../results/Figure1_v2/Figure1_v2.png" id="0" name="Picture"/>
+                    <pic:cNvPr descr="../../results/Figure1_v3/Figure1_v3.png" id="0" name="Picture"/>
                     <pic:cNvPicPr>
                       <a:picLocks noChangeArrowheads="1" noChangeAspect="1"/>
                     </pic:cNvPicPr>
@@ -868,7 +868,7 @@
                   <pic:spPr bwMode="auto">
                     <a:xfrm>
                       <a:off x="0" y="0"/>
-                      <a:ext cx="5334000" cy="4904424"/>
+                      <a:ext cx="5334000" cy="7357286"/>
                     </a:xfrm>
                     <a:prstGeom prst="rect">
                       <a:avLst/>

</xml_diff>